<commit_message>
User guide: installation chapter for the stand-alone installers
Describes the Windows Setup .exe, the portable zip and the Mac .dmg (including the
first-start security warnings), adds troubleshooting entries and the build tools.

Co-Authored-By: Claude Opus 5.5 <noreply@anthropic.com>
Claude-Session: https://claude.ai/code/session_01VVQCEfqcwwqpEWKLZWo8FS
</commit_message>
<xml_diff>
--- a/docs/MAMC_ML_Studio_User_Guide.docx
+++ b/docs/MAMC_ML_Studio_User_Guide.docx
@@ -792,38 +792,719 @@
       </w:r>
     </w:p>
     <w:p>
+      <w:r>
+        <w:t xml:space="preserve">MAMC ML Studio comes as a normal installer. </w:t>
+      </w:r>
+      <w:r>
+        <w:rPr>
+          <w:b/>
+        </w:rPr>
+        <w:t>Python and every library it needs are inside the download</w:t>
+      </w:r>
+      <w:r>
+        <w:t xml:space="preserve">, so nothing else has to be installed and no internet is needed after downloading. Download the file for your computer from </w:t>
+      </w:r>
+      <w:r>
+        <w:rPr>
+          <w:b/>
+        </w:rPr>
+        <w:t>https://github.com/ManuHCI/mamc-ml-studio/releases/latest</w:t>
+      </w:r>
+      <w:r>
+        <w:t xml:space="preserve"> (scroll down to </w:t>
+      </w:r>
+      <w:r>
+        <w:rPr>
+          <w:b/>
+        </w:rPr>
+        <w:t>Assets</w:t>
+      </w:r>
+      <w:r>
+        <w:t>).</w:t>
+      </w:r>
+    </w:p>
+    <w:tbl>
+      <w:tblPr>
+        <w:tblW w:type="auto" w:w="0"/>
+        <w:jc w:val="center"/>
+        <w:tblLook w:firstColumn="1" w:firstRow="1" w:lastColumn="0" w:lastRow="0" w:noHBand="0" w:noVBand="1" w:val="04A0"/>
+        <w:tblBorders>
+          <w:top w:val="single" w:sz="4" w:color="E6E4DF"/>
+          <w:left w:val="single" w:sz="4" w:color="E6E4DF"/>
+          <w:bottom w:val="single" w:sz="4" w:color="E6E4DF"/>
+          <w:right w:val="single" w:sz="4" w:color="E6E4DF"/>
+          <w:insideH w:val="single" w:sz="4" w:color="E6E4DF"/>
+          <w:insideV w:val="single" w:sz="4" w:color="E6E4DF"/>
+        </w:tblBorders>
+      </w:tblPr>
+      <w:tblGrid>
+        <w:gridCol w:w="4819"/>
+        <w:gridCol w:w="4819"/>
+      </w:tblGrid>
+      <w:tr>
+        <w:tc>
+          <w:tcPr>
+            <w:tcW w:type="dxa" w:w="3969"/>
+            <w:shd w:val="clear" w:color="auto" w:fill="F3EDEE"/>
+          </w:tcPr>
+          <w:p>
+            <w:r/>
+            <w:r>
+              <w:rPr>
+                <w:b/>
+                <w:sz w:val="19"/>
+              </w:rPr>
+              <w:t>Your computer</w:t>
+            </w:r>
+          </w:p>
+        </w:tc>
+        <w:tc>
+          <w:tcPr>
+            <w:tcW w:type="dxa" w:w="5386"/>
+            <w:shd w:val="clear" w:color="auto" w:fill="F3EDEE"/>
+          </w:tcPr>
+          <w:p>
+            <w:r/>
+            <w:r>
+              <w:rPr>
+                <w:b/>
+                <w:sz w:val="19"/>
+              </w:rPr>
+              <w:t>Download this file</w:t>
+            </w:r>
+          </w:p>
+        </w:tc>
+      </w:tr>
+      <w:tr>
+        <w:tc>
+          <w:tcPr>
+            <w:tcW w:type="dxa" w:w="3969"/>
+          </w:tcPr>
+          <w:p>
+            <w:r/>
+            <w:r>
+              <w:rPr>
+                <w:sz w:val="19"/>
+              </w:rPr>
+              <w:t>Windows 10 / 11 (64-bit)</w:t>
+            </w:r>
+          </w:p>
+        </w:tc>
+        <w:tc>
+          <w:tcPr>
+            <w:tcW w:type="dxa" w:w="5386"/>
+          </w:tcPr>
+          <w:p>
+            <w:r/>
+            <w:r>
+              <w:rPr>
+                <w:sz w:val="19"/>
+              </w:rPr>
+              <w:t>MAMC_ML_Studio_Setup_1.0.0_Windows10-11.exe</w:t>
+            </w:r>
+          </w:p>
+        </w:tc>
+      </w:tr>
+      <w:tr>
+        <w:tc>
+          <w:tcPr>
+            <w:tcW w:type="dxa" w:w="3969"/>
+          </w:tcPr>
+          <w:p>
+            <w:r/>
+            <w:r>
+              <w:rPr>
+                <w:sz w:val="19"/>
+              </w:rPr>
+              <w:t>Windows PC where you cannot install (college PC)</w:t>
+            </w:r>
+          </w:p>
+        </w:tc>
+        <w:tc>
+          <w:tcPr>
+            <w:tcW w:type="dxa" w:w="5386"/>
+          </w:tcPr>
+          <w:p>
+            <w:r/>
+            <w:r>
+              <w:rPr>
+                <w:sz w:val="19"/>
+              </w:rPr>
+              <w:t>MAMC_ML_Studio_1.0.0_Windows_portable.zip</w:t>
+            </w:r>
+          </w:p>
+        </w:tc>
+      </w:tr>
+      <w:tr>
+        <w:tc>
+          <w:tcPr>
+            <w:tcW w:type="dxa" w:w="3969"/>
+          </w:tcPr>
+          <w:p>
+            <w:r/>
+            <w:r>
+              <w:rPr>
+                <w:sz w:val="19"/>
+              </w:rPr>
+              <w:t>Mac with Apple chip (M1, M2, M3, M4)</w:t>
+            </w:r>
+          </w:p>
+        </w:tc>
+        <w:tc>
+          <w:tcPr>
+            <w:tcW w:type="dxa" w:w="5386"/>
+          </w:tcPr>
+          <w:p>
+            <w:r/>
+            <w:r>
+              <w:rPr>
+                <w:sz w:val="19"/>
+              </w:rPr>
+              <w:t>MAMC_ML_Studio_1.0.0_macOS-AppleSilicon.dmg</w:t>
+            </w:r>
+          </w:p>
+        </w:tc>
+      </w:tr>
+      <w:tr>
+        <w:tc>
+          <w:tcPr>
+            <w:tcW w:type="dxa" w:w="3969"/>
+          </w:tcPr>
+          <w:p>
+            <w:r/>
+            <w:r>
+              <w:rPr>
+                <w:sz w:val="19"/>
+              </w:rPr>
+              <w:t>Mac with Intel processor</w:t>
+            </w:r>
+          </w:p>
+        </w:tc>
+        <w:tc>
+          <w:tcPr>
+            <w:tcW w:type="dxa" w:w="5386"/>
+          </w:tcPr>
+          <w:p>
+            <w:r/>
+            <w:r>
+              <w:rPr>
+                <w:sz w:val="19"/>
+              </w:rPr>
+              <w:t>MAMC_ML_Studio_1.0.0_macOS-Intel.dmg</w:t>
+            </w:r>
+          </w:p>
+        </w:tc>
+      </w:tr>
+    </w:tbl>
+    <w:p>
+      <w:pPr>
+        <w:spacing w:after="40"/>
+      </w:pPr>
+    </w:p>
+    <w:p>
+      <w:r>
+        <w:t xml:space="preserve">Needs Windows 10 or 11 (64-bit) or macOS 12 Monterey or newer, about 1.5 GB of free disk space and 4 GB RAM. Not sure which Mac you have? Apple menu &gt; </w:t>
+      </w:r>
+      <w:r>
+        <w:rPr>
+          <w:b/>
+        </w:rPr>
+        <w:t>About This Mac</w:t>
+      </w:r>
+      <w:r>
+        <w:t>: 'Chip: Apple M...' means Apple chip, 'Processor: Intel...' means Intel.</w:t>
+      </w:r>
+    </w:p>
+    <w:p>
       <w:pPr>
         <w:pStyle w:val="Heading2"/>
       </w:pPr>
       <w:r>
-        <w:t>2.1 Windows</w:t>
+        <w:t>2.1 Windows 10 / 11</w:t>
       </w:r>
     </w:p>
     <w:p>
       <w:pPr>
-        <w:pStyle w:val="ListNumber"/>
+        <w:tabs>
+          <w:tab w:pos="510" w:val="left"/>
+        </w:tabs>
         <w:spacing w:after="40"/>
+        <w:ind w:left="510" w:hanging="340"/>
       </w:pPr>
       <w:r>
-        <w:t xml:space="preserve">Copy the folder </w:t>
+        <w:t>1.</w:t>
+        <w:tab/>
+        <w:t xml:space="preserve">Double-click the downloaded </w:t>
       </w:r>
       <w:r>
         <w:rPr>
           <w:b/>
         </w:rPr>
-        <w:t>ML_software</w:t>
-      </w:r>
-      <w:r>
-        <w:t xml:space="preserve"> (or wherever MAMC ML Studio was saved) to your computer.</w:t>
+        <w:t>MAMC_ML_Studio_Setup_...exe</w:t>
+      </w:r>
+      <w:r>
+        <w:t>.</w:t>
       </w:r>
     </w:p>
     <w:p>
       <w:pPr>
-        <w:pStyle w:val="ListNumber"/>
+        <w:tabs>
+          <w:tab w:pos="510" w:val="left"/>
+        </w:tabs>
+        <w:spacing w:after="40"/>
+        <w:ind w:left="510" w:hanging="340"/>
+      </w:pPr>
+      <w:r>
+        <w:t>2.</w:t>
+        <w:tab/>
+        <w:t xml:space="preserve">A blue box </w:t>
+      </w:r>
+      <w:r>
+        <w:rPr>
+          <w:b/>
+        </w:rPr>
+        <w:t>'Windows protected your PC'</w:t>
+      </w:r>
+      <w:r>
+        <w:t xml:space="preserve"> appears (the software is safe, but new and not signed with a paid certificate). Click the small words </w:t>
+      </w:r>
+      <w:r>
+        <w:rPr>
+          <w:b/>
+        </w:rPr>
+        <w:t>More info</w:t>
+      </w:r>
+      <w:r>
+        <w:t xml:space="preserve">, then </w:t>
+      </w:r>
+      <w:r>
+        <w:rPr>
+          <w:b/>
+        </w:rPr>
+        <w:t>Run anyway</w:t>
+      </w:r>
+      <w:r>
+        <w:t>. Do not click 'Don't run'.</w:t>
+      </w:r>
+    </w:p>
+    <w:p>
+      <w:pPr>
+        <w:tabs>
+          <w:tab w:pos="510" w:val="left"/>
+        </w:tabs>
+        <w:spacing w:after="40"/>
+        <w:ind w:left="510" w:hanging="340"/>
+      </w:pPr>
+      <w:r>
+        <w:t>3.</w:t>
+        <w:tab/>
+        <w:t xml:space="preserve">Click </w:t>
+      </w:r>
+      <w:r>
+        <w:rPr>
+          <w:b/>
+        </w:rPr>
+        <w:t>Next &gt; I Agree &gt; Install &gt; Finish</w:t>
+      </w:r>
+      <w:r>
+        <w:t>. No administrator password is needed.</w:t>
+      </w:r>
+    </w:p>
+    <w:p>
+      <w:pPr>
+        <w:tabs>
+          <w:tab w:pos="510" w:val="left"/>
+        </w:tabs>
+        <w:spacing w:after="40"/>
+        <w:ind w:left="510" w:hanging="340"/>
+      </w:pPr>
+      <w:r>
+        <w:t>4.</w:t>
+        <w:tab/>
+        <w:t xml:space="preserve">Start the software from the </w:t>
+      </w:r>
+      <w:r>
+        <w:rPr>
+          <w:b/>
+        </w:rPr>
+        <w:t>MAMC ML Studio</w:t>
+      </w:r>
+      <w:r>
+        <w:t xml:space="preserve"> icon on your Desktop (or the Start menu).</w:t>
+      </w:r>
+    </w:p>
+    <w:p>
+      <w:pPr>
+        <w:tabs>
+          <w:tab w:pos="510" w:val="left"/>
+        </w:tabs>
+        <w:spacing w:after="40"/>
+        <w:ind w:left="510" w:hanging="340"/>
+      </w:pPr>
+      <w:r>
+        <w:t>5.</w:t>
+        <w:tab/>
+        <w:t xml:space="preserve">A small 'Starting...' window appears and after a few seconds the software opens in </w:t>
+      </w:r>
+      <w:r>
+        <w:rPr>
+          <w:b/>
+        </w:rPr>
+        <w:t>its own window</w:t>
+      </w:r>
+      <w:r>
+        <w:t>.</w:t>
+      </w:r>
+    </w:p>
+    <w:p>
+      <w:pPr>
+        <w:tabs>
+          <w:tab w:pos="510" w:val="left"/>
+        </w:tabs>
+        <w:spacing w:after="40"/>
+        <w:ind w:left="510" w:hanging="340"/>
+      </w:pPr>
+      <w:r>
+        <w:t>6.</w:t>
+        <w:tab/>
+        <w:t xml:space="preserve">To quit, simply </w:t>
+      </w:r>
+      <w:r>
+        <w:rPr>
+          <w:b/>
+        </w:rPr>
+        <w:t>close the window</w:t>
+      </w:r>
+      <w:r>
+        <w:t>. The software stops by itself after half a minute.</w:t>
+      </w:r>
+    </w:p>
+    <w:tbl>
+      <w:tblPr>
+        <w:tblW w:type="auto" w:w="0"/>
+        <w:jc w:val="center"/>
+        <w:tblLook w:firstColumn="1" w:firstRow="1" w:lastColumn="0" w:lastRow="0" w:noHBand="0" w:noVBand="1" w:val="04A0"/>
+        <w:tblBorders>
+          <w:top w:val="single" w:sz="4" w:color="F0E6E0"/>
+          <w:left w:val="single" w:sz="24" w:color="2A78D6"/>
+          <w:bottom w:val="single" w:sz="4" w:color="F0E6E0"/>
+          <w:right w:val="single" w:sz="4" w:color="F0E6E0"/>
+          <w:insideH w:val="single" w:sz="4" w:color="F0E6E0"/>
+          <w:insideV w:val="single" w:sz="4" w:color="F0E6E0"/>
+        </w:tblBorders>
+      </w:tblPr>
+      <w:tblGrid>
+        <w:gridCol w:w="9638"/>
+      </w:tblGrid>
+      <w:tr>
+        <w:tc>
+          <w:tcPr>
+            <w:tcW w:type="dxa" w:w="9638"/>
+            <w:shd w:val="clear" w:color="auto" w:fill="EEF5FB"/>
+          </w:tcPr>
+          <w:p>
+            <w:r/>
+            <w:r>
+              <w:rPr>
+                <w:b/>
+                <w:color w:val="1C5CAB"/>
+              </w:rPr>
+              <w:t>Download warning</w:t>
+            </w:r>
+          </w:p>
+          <w:p>
+            <w:r>
+              <w:rPr>
+                <w:sz w:val="21"/>
+              </w:rPr>
+              <w:t xml:space="preserve">If Edge or Chrome says the file 'isn't commonly downloaded', click the three dots next to the download, then </w:t>
+            </w:r>
+            <w:r>
+              <w:rPr>
+                <w:b/>
+                <w:sz w:val="21"/>
+              </w:rPr>
+              <w:t>Keep</w:t>
+            </w:r>
+            <w:r>
+              <w:rPr>
+                <w:sz w:val="21"/>
+              </w:rPr>
+              <w:t xml:space="preserve"> and </w:t>
+            </w:r>
+            <w:r>
+              <w:rPr>
+                <w:b/>
+                <w:sz w:val="21"/>
+              </w:rPr>
+              <w:t>Keep anyway</w:t>
+            </w:r>
+            <w:r>
+              <w:rPr>
+                <w:sz w:val="21"/>
+              </w:rPr>
+              <w:t>. To remove the software later: Settings &gt; Apps &gt; MAMC ML Studio &gt; Uninstall.</w:t>
+            </w:r>
+          </w:p>
+        </w:tc>
+      </w:tr>
+    </w:tbl>
+    <w:p>
+      <w:pPr>
         <w:spacing w:after="40"/>
       </w:pPr>
-      <w:r>
-        <w:t xml:space="preserve">Double-click </w:t>
+    </w:p>
+    <w:p>
+      <w:pPr>
+        <w:pStyle w:val="Heading2"/>
+      </w:pPr>
+      <w:r>
+        <w:t>2.2 Windows - portable version (no installation)</w:t>
+      </w:r>
+    </w:p>
+    <w:p>
+      <w:pPr>
+        <w:tabs>
+          <w:tab w:pos="510" w:val="left"/>
+        </w:tabs>
+        <w:spacing w:after="40"/>
+        <w:ind w:left="510" w:hanging="340"/>
+      </w:pPr>
+      <w:r>
+        <w:t>1.</w:t>
+        <w:tab/>
+        <w:t xml:space="preserve">Right-click the downloaded </w:t>
+      </w:r>
+      <w:r>
+        <w:rPr>
+          <w:b/>
+        </w:rPr>
+        <w:t>..._Windows_portable.zip</w:t>
+      </w:r>
+      <w:r>
+        <w:t xml:space="preserve"> and choose </w:t>
+      </w:r>
+      <w:r>
+        <w:rPr>
+          <w:b/>
+        </w:rPr>
+        <w:t>Extract All</w:t>
+      </w:r>
+      <w:r>
+        <w:t>.</w:t>
+      </w:r>
+    </w:p>
+    <w:p>
+      <w:pPr>
+        <w:tabs>
+          <w:tab w:pos="510" w:val="left"/>
+        </w:tabs>
+        <w:spacing w:after="40"/>
+        <w:ind w:left="510" w:hanging="340"/>
+      </w:pPr>
+      <w:r>
+        <w:t>2.</w:t>
+        <w:tab/>
+        <w:t xml:space="preserve">Open the extracted folder </w:t>
+      </w:r>
+      <w:r>
+        <w:rPr>
+          <w:b/>
+        </w:rPr>
+        <w:t>MAMC_ML_Studio</w:t>
+      </w:r>
+      <w:r>
+        <w:t xml:space="preserve"> and double-click </w:t>
+      </w:r>
+      <w:r>
+        <w:rPr>
+          <w:b/>
+        </w:rPr>
+        <w:t>MAMC ML Studio.exe</w:t>
+      </w:r>
+      <w:r>
+        <w:t xml:space="preserve"> (if Windows warns: More info &gt; Run anyway).</w:t>
+      </w:r>
+    </w:p>
+    <w:p>
+      <w:pPr>
+        <w:tabs>
+          <w:tab w:pos="510" w:val="left"/>
+        </w:tabs>
+        <w:spacing w:after="40"/>
+        <w:ind w:left="510" w:hanging="340"/>
+      </w:pPr>
+      <w:r>
+        <w:t>3.</w:t>
+        <w:tab/>
+        <w:t>Keep the whole folder together; it can also be copied to a pen drive.</w:t>
+      </w:r>
+    </w:p>
+    <w:p>
+      <w:pPr>
+        <w:pStyle w:val="Heading2"/>
+      </w:pPr>
+      <w:r>
+        <w:t>2.3 Mac</w:t>
+      </w:r>
+    </w:p>
+    <w:p>
+      <w:pPr>
+        <w:tabs>
+          <w:tab w:pos="510" w:val="left"/>
+        </w:tabs>
+        <w:spacing w:after="40"/>
+        <w:ind w:left="510" w:hanging="340"/>
+      </w:pPr>
+      <w:r>
+        <w:t>1.</w:t>
+        <w:tab/>
+        <w:t xml:space="preserve">Open the downloaded </w:t>
+      </w:r>
+      <w:r>
+        <w:rPr>
+          <w:b/>
+        </w:rPr>
+        <w:t>.dmg</w:t>
+      </w:r>
+      <w:r>
+        <w:t xml:space="preserve"> file and drag </w:t>
+      </w:r>
+      <w:r>
+        <w:rPr>
+          <w:b/>
+        </w:rPr>
+        <w:t>MAMC ML Studio</w:t>
+      </w:r>
+      <w:r>
+        <w:t xml:space="preserve"> onto the </w:t>
+      </w:r>
+      <w:r>
+        <w:rPr>
+          <w:b/>
+        </w:rPr>
+        <w:t>Applications</w:t>
+      </w:r>
+      <w:r>
+        <w:t xml:space="preserve"> folder.</w:t>
+      </w:r>
+    </w:p>
+    <w:p>
+      <w:pPr>
+        <w:tabs>
+          <w:tab w:pos="510" w:val="left"/>
+        </w:tabs>
+        <w:spacing w:after="40"/>
+        <w:ind w:left="510" w:hanging="340"/>
+      </w:pPr>
+      <w:r>
+        <w:t>2.</w:t>
+        <w:tab/>
+        <w:t xml:space="preserve">Open Applications, </w:t>
+      </w:r>
+      <w:r>
+        <w:rPr>
+          <w:b/>
+        </w:rPr>
+        <w:t>right-click</w:t>
+      </w:r>
+      <w:r>
+        <w:t xml:space="preserve"> (or Control-click) MAMC ML Studio and choose </w:t>
+      </w:r>
+      <w:r>
+        <w:rPr>
+          <w:b/>
+        </w:rPr>
+        <w:t>Open</w:t>
+      </w:r>
+      <w:r>
+        <w:t xml:space="preserve">, then </w:t>
+      </w:r>
+      <w:r>
+        <w:rPr>
+          <w:b/>
+        </w:rPr>
+        <w:t>Open</w:t>
+      </w:r>
+      <w:r>
+        <w:t xml:space="preserve"> again. This is needed only the first time, because the app is not from the App Store.</w:t>
+      </w:r>
+    </w:p>
+    <w:p>
+      <w:pPr>
+        <w:tabs>
+          <w:tab w:pos="510" w:val="left"/>
+        </w:tabs>
+        <w:spacing w:after="40"/>
+        <w:ind w:left="510" w:hanging="340"/>
+      </w:pPr>
+      <w:r>
+        <w:t>3.</w:t>
+        <w:tab/>
+        <w:t xml:space="preserve">On macOS 15 or newer, if there is no Open button: click </w:t>
+      </w:r>
+      <w:r>
+        <w:rPr>
+          <w:b/>
+        </w:rPr>
+        <w:t>Done</w:t>
+      </w:r>
+      <w:r>
+        <w:t xml:space="preserve">, open </w:t>
+      </w:r>
+      <w:r>
+        <w:rPr>
+          <w:b/>
+        </w:rPr>
+        <w:t>System Settings &gt; Privacy &amp; Security</w:t>
+      </w:r>
+      <w:r>
+        <w:t xml:space="preserve">, scroll down and click </w:t>
+      </w:r>
+      <w:r>
+        <w:rPr>
+          <w:b/>
+        </w:rPr>
+        <w:t>Open Anyway</w:t>
+      </w:r>
+      <w:r>
+        <w:t>.</w:t>
+      </w:r>
+    </w:p>
+    <w:p>
+      <w:pPr>
+        <w:tabs>
+          <w:tab w:pos="510" w:val="left"/>
+        </w:tabs>
+        <w:spacing w:after="40"/>
+        <w:ind w:left="510" w:hanging="340"/>
+      </w:pPr>
+      <w:r>
+        <w:t>4.</w:t>
+        <w:tab/>
+        <w:t>The software opens in its own window (Chrome or Edge if installed, otherwise Safari). Close the window to quit.</w:t>
+      </w:r>
+    </w:p>
+    <w:p>
+      <w:pPr>
+        <w:pStyle w:val="Heading2"/>
+      </w:pPr>
+      <w:r>
+        <w:t>2.4 Running from the source code (for developers)</w:t>
+      </w:r>
+    </w:p>
+    <w:p>
+      <w:r>
+        <w:t xml:space="preserve">The source code edition needs </w:t>
+      </w:r>
+      <w:r>
+        <w:rPr>
+          <w:b/>
+        </w:rPr>
+        <w:t>Python 3.10 or newer</w:t>
+      </w:r>
+      <w:r>
+        <w:t xml:space="preserve">. Windows: double-click </w:t>
       </w:r>
       <w:r>
         <w:rPr>
@@ -832,25 +1513,26 @@
         <w:t>START_MAMC_ML_Studio_Windows.bat</w:t>
       </w:r>
       <w:r>
-        <w:t>.</w:t>
-      </w:r>
-    </w:p>
-    <w:p>
-      <w:pPr>
-        <w:pStyle w:val="ListNumber"/>
-        <w:spacing w:after="40"/>
-      </w:pPr>
-      <w:r>
-        <w:t xml:space="preserve">The </w:t>
+        <w:t xml:space="preserve">; Mac: </w:t>
       </w:r>
       <w:r>
         <w:rPr>
           <w:b/>
         </w:rPr>
-        <w:t>first time</w:t>
-      </w:r>
-      <w:r>
-        <w:t xml:space="preserve">, a black window sets everything up: it creates a private Python environment in the folder </w:t>
+        <w:t>START_MAMC_ML_Studio_Mac.command</w:t>
+      </w:r>
+      <w:r>
+        <w:t xml:space="preserve">; Linux: </w:t>
+      </w:r>
+      <w:r>
+        <w:rPr>
+          <w:rFonts w:ascii="Consolas" w:hAnsi="Consolas"/>
+          <w:sz w:val="20"/>
+        </w:rPr>
+        <w:t>bash start_mamc_ml_studio_linux.sh</w:t>
+      </w:r>
+      <w:r>
+        <w:t xml:space="preserve">. The first start creates a private Python environment in the folder </w:t>
       </w:r>
       <w:r>
         <w:rPr>
@@ -860,73 +1542,24 @@
         <w:t>.venv</w:t>
       </w:r>
       <w:r>
-        <w:t xml:space="preserve"> and downloads the components (internet needed, about 5-10 minutes). Do not close the window.</w:t>
-      </w:r>
-    </w:p>
-    <w:p>
-      <w:pPr>
-        <w:pStyle w:val="ListNumber"/>
-        <w:spacing w:after="40"/>
-      </w:pPr>
-      <w:r>
-        <w:t xml:space="preserve">When it is ready, the software opens in your web browser (Chrome or Edge) at </w:t>
+        <w:t xml:space="preserve"> and downloads the components (internet needed, 5-10 minutes). Experienced users can also run </w:t>
       </w:r>
       <w:r>
         <w:rPr>
           <w:rFonts w:ascii="Consolas" w:hAnsi="Consolas"/>
           <w:sz w:val="20"/>
         </w:rPr>
-        <w:t>http://localhost:8501</w:t>
-      </w:r>
-      <w:r>
-        <w:t>.</w:t>
-      </w:r>
-    </w:p>
-    <w:p>
-      <w:pPr>
-        <w:pStyle w:val="ListNumber"/>
-        <w:spacing w:after="40"/>
-      </w:pPr>
-      <w:r>
-        <w:t xml:space="preserve">Later starts take only a few seconds and work </w:t>
+        <w:t>pip install -r requirements.txt</w:t>
+      </w:r>
+      <w:r>
+        <w:t xml:space="preserve"> and then </w:t>
       </w:r>
       <w:r>
         <w:rPr>
-          <w:b/>
+          <w:rFonts w:ascii="Consolas" w:hAnsi="Consolas"/>
+          <w:sz w:val="20"/>
         </w:rPr>
-        <w:t>without internet</w:t>
-      </w:r>
-      <w:r>
-        <w:t>.</w:t>
-      </w:r>
-    </w:p>
-    <w:p>
-      <w:pPr>
-        <w:pStyle w:val="ListNumber"/>
-        <w:spacing w:after="40"/>
-      </w:pPr>
-      <w:r>
-        <w:t>To stop the software, close the black window.</w:t>
-      </w:r>
-    </w:p>
-    <w:p>
-      <w:r>
-        <w:t xml:space="preserve">The starter needs </w:t>
-      </w:r>
-      <w:r>
-        <w:rPr>
-          <w:b/>
-        </w:rPr>
-        <w:t>Python 3.10 or newer</w:t>
-      </w:r>
-      <w:r>
-        <w:t xml:space="preserve">. It finds Python from python.org, the 'py' launcher, or Anaconda / Miniconda. If none is installed, it tells you; install Python from https://www.python.org/downloads/ and tick </w:t>
-      </w:r>
-      <w:r>
-        <w:rPr>
-          <w:b/>
-        </w:rPr>
-        <w:t>Add python.exe to PATH</w:t>
+        <w:t>streamlit run app.py</w:t>
       </w:r>
       <w:r>
         <w:t>.</w:t>
@@ -937,81 +1570,7 @@
         <w:pStyle w:val="Heading2"/>
       </w:pPr>
       <w:r>
-        <w:t>2.2 Mac and Linux</w:t>
-      </w:r>
-    </w:p>
-    <w:p>
-      <w:pPr>
-        <w:pStyle w:val="ListBullet"/>
-        <w:spacing w:after="40"/>
-      </w:pPr>
-      <w:r>
-        <w:t xml:space="preserve">Mac: double-click </w:t>
-      </w:r>
-      <w:r>
-        <w:rPr>
-          <w:b/>
-        </w:rPr>
-        <w:t>START_MAMC_ML_Studio_Mac.command</w:t>
-      </w:r>
-      <w:r>
-        <w:t xml:space="preserve"> (the first time: right-click -&gt; Open).</w:t>
-      </w:r>
-    </w:p>
-    <w:p>
-      <w:pPr>
-        <w:pStyle w:val="ListBullet"/>
-        <w:spacing w:after="40"/>
-      </w:pPr>
-      <w:r>
-        <w:t xml:space="preserve">Linux: open a terminal in the folder and type </w:t>
-      </w:r>
-      <w:r>
-        <w:rPr>
-          <w:rFonts w:ascii="Consolas" w:hAnsi="Consolas"/>
-          <w:sz w:val="20"/>
-        </w:rPr>
-        <w:t>bash start_mamc_ml_studio_linux.sh</w:t>
-      </w:r>
-      <w:r>
-        <w:t>.</w:t>
-      </w:r>
-    </w:p>
-    <w:p>
-      <w:pPr>
-        <w:pStyle w:val="ListBullet"/>
-        <w:spacing w:after="40"/>
-      </w:pPr>
-      <w:r>
-        <w:t xml:space="preserve">Experienced users can also run </w:t>
-      </w:r>
-      <w:r>
-        <w:rPr>
-          <w:rFonts w:ascii="Consolas" w:hAnsi="Consolas"/>
-          <w:sz w:val="20"/>
-        </w:rPr>
-        <w:t>pip install -r requirements.txt</w:t>
-      </w:r>
-      <w:r>
-        <w:t xml:space="preserve"> and then </w:t>
-      </w:r>
-      <w:r>
-        <w:rPr>
-          <w:rFonts w:ascii="Consolas" w:hAnsi="Consolas"/>
-          <w:sz w:val="20"/>
-        </w:rPr>
-        <w:t>streamlit run app.py</w:t>
-      </w:r>
-      <w:r>
-        <w:t>.</w:t>
-      </w:r>
-    </w:p>
-    <w:p>
-      <w:pPr>
-        <w:pStyle w:val="Heading2"/>
-      </w:pPr>
-      <w:r>
-        <w:t>2.3 The screen layout</w:t>
+        <w:t>2.5 The screen layout</w:t>
       </w:r>
     </w:p>
     <w:p>
@@ -5006,7 +5565,7 @@
         <w:rPr>
           <w:b/>
         </w:rPr>
-        <w:t>The black window says Python was not found.</w:t>
+        <w:t>Windows says 'Windows protected your PC'.</w:t>
       </w:r>
     </w:p>
     <w:p>
@@ -5014,7 +5573,25 @@
         <w:spacing w:after="160"/>
       </w:pPr>
       <w:r>
-        <w:t>Install Python 3.10 or newer from python.org, tick 'Add python.exe to PATH', and double-click the starter again. Anaconda also works.</w:t>
+        <w:t xml:space="preserve">Click </w:t>
+      </w:r>
+      <w:r>
+        <w:rPr>
+          <w:b/>
+        </w:rPr>
+        <w:t>More info</w:t>
+      </w:r>
+      <w:r>
+        <w:t xml:space="preserve">, then </w:t>
+      </w:r>
+      <w:r>
+        <w:rPr>
+          <w:b/>
+        </w:rPr>
+        <w:t>Run anyway</w:t>
+      </w:r>
+      <w:r>
+        <w:t>. This appears because the software is new and not signed with a paid certificate.</w:t>
       </w:r>
     </w:p>
     <w:p>
@@ -5025,7 +5602,7 @@
         <w:rPr>
           <w:b/>
         </w:rPr>
-        <w:t>The first start stops with an installation error.</w:t>
+        <w:t>The Mac says the app cannot be opened.</w:t>
       </w:r>
     </w:p>
     <w:p>
@@ -5033,17 +5610,17 @@
         <w:spacing w:after="160"/>
       </w:pPr>
       <w:r>
-        <w:t xml:space="preserve">The first start needs internet to download the components. Check the connection (college proxies sometimes block downloads), then start again. To start completely afresh, delete the folder </w:t>
+        <w:t xml:space="preserve">Right-click the app in Applications &gt; Open &gt; Open. On macOS 15 or newer: System Settings &gt; Privacy &amp; Security &gt; Open Anyway. Only if it says the app 'is damaged': open Terminal, paste </w:t>
       </w:r>
       <w:r>
         <w:rPr>
           <w:rFonts w:ascii="Consolas" w:hAnsi="Consolas"/>
           <w:sz w:val="20"/>
         </w:rPr>
-        <w:t>.venv</w:t>
-      </w:r>
-      <w:r>
-        <w:t xml:space="preserve"> inside the software folder.</w:t>
+        <w:t>xattr -cr "/Applications/MAMC ML Studio.app"</w:t>
+      </w:r>
+      <w:r>
+        <w:t>, press Enter and open the app again.</w:t>
       </w:r>
     </w:p>
     <w:p>
@@ -5054,7 +5631,7 @@
         <w:rPr>
           <w:b/>
         </w:rPr>
-        <w:t>The browser did not open.</w:t>
+        <w:t>The Mac says 'This copy is for Macs with an Apple chip'.</w:t>
       </w:r>
     </w:p>
     <w:p>
@@ -5062,7 +5639,103 @@
         <w:spacing w:after="160"/>
       </w:pPr>
       <w:r>
-        <w:t>Open Chrome or Edge and type the address shown in the black window, e.g. http://localhost:8501.</w:t>
+        <w:t xml:space="preserve">Download the </w:t>
+      </w:r>
+      <w:r>
+        <w:rPr>
+          <w:b/>
+        </w:rPr>
+        <w:t>Intel</w:t>
+      </w:r>
+      <w:r>
+        <w:t xml:space="preserve"> edition (file ending in macOS-Intel.dmg).</w:t>
+      </w:r>
+    </w:p>
+    <w:p>
+      <w:pPr>
+        <w:spacing w:after="20"/>
+      </w:pPr>
+      <w:r>
+        <w:rPr>
+          <w:b/>
+        </w:rPr>
+        <w:t>Nothing happens or a message says the software could not start.</w:t>
+      </w:r>
+    </w:p>
+    <w:p>
+      <w:pPr>
+        <w:spacing w:after="160"/>
+      </w:pPr>
+      <w:r>
+        <w:t xml:space="preserve">Wait a minute - the very first start after installation is slower. If it still fails, the details are in the file </w:t>
+      </w:r>
+      <w:r>
+        <w:rPr>
+          <w:rFonts w:ascii="Consolas" w:hAnsi="Consolas"/>
+          <w:sz w:val="20"/>
+        </w:rPr>
+        <w:t>last_run.log</w:t>
+      </w:r>
+      <w:r>
+        <w:t xml:space="preserve">: on Windows in </w:t>
+      </w:r>
+      <w:r>
+        <w:rPr>
+          <w:rFonts w:ascii="Consolas" w:hAnsi="Consolas"/>
+          <w:sz w:val="20"/>
+        </w:rPr>
+        <w:t>%LOCALAPPDATA%\MAMC ML Studio</w:t>
+      </w:r>
+      <w:r>
+        <w:t xml:space="preserve">, on a Mac in </w:t>
+      </w:r>
+      <w:r>
+        <w:rPr>
+          <w:rFonts w:ascii="Consolas" w:hAnsi="Consolas"/>
+          <w:sz w:val="20"/>
+        </w:rPr>
+        <w:t>~/Library/Application Support/MAMC ML Studio</w:t>
+      </w:r>
+      <w:r>
+        <w:t>. Send this file to the developers.</w:t>
+      </w:r>
+    </w:p>
+    <w:p>
+      <w:pPr>
+        <w:spacing w:after="20"/>
+      </w:pPr>
+      <w:r>
+        <w:rPr>
+          <w:b/>
+        </w:rPr>
+        <w:t>The window closed but I want to continue.</w:t>
+      </w:r>
+    </w:p>
+    <w:p>
+      <w:pPr>
+        <w:spacing w:after="160"/>
+      </w:pPr>
+      <w:r>
+        <w:t>Open MAMC ML Studio again from its icon. Your data are not kept between sessions, so download the cleaned data and the report before closing.</w:t>
+      </w:r>
+    </w:p>
+    <w:p>
+      <w:pPr>
+        <w:spacing w:after="20"/>
+      </w:pPr>
+      <w:r>
+        <w:rPr>
+          <w:b/>
+        </w:rPr>
+        <w:t>(Source code edition) Python was not found / the first start fails.</w:t>
+      </w:r>
+    </w:p>
+    <w:p>
+      <w:pPr>
+        <w:spacing w:after="160"/>
+      </w:pPr>
+      <w:r>
+        <w:t>Install Python 3.10 or newer from python.org (tick 'Add python.exe to PATH'); the first start needs internet. Or use the installer instead - it needs neither.</w:t>
       </w:r>
     </w:p>
     <w:p>
@@ -5276,6 +5949,36 @@
               <w:rPr>
                 <w:sz w:val="19"/>
               </w:rPr>
+              <w:t>desktop_launcher.py</w:t>
+            </w:r>
+          </w:p>
+        </w:tc>
+        <w:tc>
+          <w:tcPr>
+            <w:tcW w:type="dxa" w:w="5953"/>
+          </w:tcPr>
+          <w:p>
+            <w:r/>
+            <w:r>
+              <w:rPr>
+                <w:sz w:val="19"/>
+              </w:rPr>
+              <w:t>Installed edition: starts the bundled Python, opens the program window, stops when it is closed</w:t>
+            </w:r>
+          </w:p>
+        </w:tc>
+      </w:tr>
+      <w:tr>
+        <w:tc>
+          <w:tcPr>
+            <w:tcW w:type="dxa" w:w="3402"/>
+          </w:tcPr>
+          <w:p>
+            <w:r/>
+            <w:r>
+              <w:rPr>
+                <w:sz w:val="19"/>
+              </w:rPr>
               <w:t>launcher.py</w:t>
             </w:r>
           </w:p>
@@ -5290,7 +5993,37 @@
               <w:rPr>
                 <w:sz w:val="19"/>
               </w:rPr>
-              <w:t>Creates the private environment, installs the components, starts the app</w:t>
+              <w:t>Source edition: creates the private environment, installs the components, starts the app</w:t>
+            </w:r>
+          </w:p>
+        </w:tc>
+      </w:tr>
+      <w:tr>
+        <w:tc>
+          <w:tcPr>
+            <w:tcW w:type="dxa" w:w="3402"/>
+          </w:tcPr>
+          <w:p>
+            <w:r/>
+            <w:r>
+              <w:rPr>
+                <w:sz w:val="19"/>
+              </w:rPr>
+              <w:t>build_tools/</w:t>
+            </w:r>
+          </w:p>
+        </w:tc>
+        <w:tc>
+          <w:tcPr>
+            <w:tcW w:type="dxa" w:w="5953"/>
+          </w:tcPr>
+          <w:p>
+            <w:r/>
+            <w:r>
+              <w:rPr>
+                <w:sz w:val="19"/>
+              </w:rPr>
+              <w:t>Builds the Windows installer and portable zip (build_windows.py) and the Mac .dmg (build_mac.py)</w:t>
             </w:r>
           </w:p>
         </w:tc>
@@ -5593,7 +6326,7 @@
         <w:t>python tests/run_engine_tests.py</w:t>
       </w:r>
       <w:r>
-        <w:t xml:space="preserve"> after changes. Teaching texts for each algorithm are in </w:t>
+        <w:t xml:space="preserve"> after changes. The installers are built and tested automatically on GitHub (Actions tab): pushing a tag such as v1.0.1 publishes a new release with all four downloads. Teaching texts for each algorithm are in </w:t>
       </w:r>
       <w:r>
         <w:rPr>

</xml_diff>

<commit_message>
Explain the Windows 11 Smart App Control block (guide and README)
Smart App Control blocks unsigned extension modules such as pandas .pyd files
(Code Integrity event 3077). Document how to switch it off.

Co-Authored-By: Claude Opus 5.5 <noreply@anthropic.com>
Claude-Session: https://claude.ai/code/session_01VVQCEfqcwwqpEWKLZWo8FS
</commit_message>
<xml_diff>
--- a/docs/MAMC_ML_Studio_User_Guide.docx
+++ b/docs/MAMC_ML_Studio_User_Guide.docx
@@ -5602,6 +5602,52 @@
         <w:rPr>
           <w:b/>
         </w:rPr>
+        <w:t>Windows says 'Smart App Control has blocked part of this app', or nothing opens.</w:t>
+      </w:r>
+    </w:p>
+    <w:p>
+      <w:pPr>
+        <w:spacing w:after="160"/>
+      </w:pPr>
+      <w:r>
+        <w:t xml:space="preserve">New Windows 11 laptops have </w:t>
+      </w:r>
+      <w:r>
+        <w:rPr>
+          <w:b/>
+        </w:rPr>
+        <w:t>Smart App Control</w:t>
+      </w:r>
+      <w:r>
+        <w:t xml:space="preserve"> switched on. It blocks programs that are not signed with a paid certificate, including the libraries inside MAMC ML Studio. Open </w:t>
+      </w:r>
+      <w:r>
+        <w:rPr>
+          <w:b/>
+        </w:rPr>
+        <w:t>Windows Security &gt; App &amp; browser control &gt; Smart App Control settings</w:t>
+      </w:r>
+      <w:r>
+        <w:t xml:space="preserve"> and choose </w:t>
+      </w:r>
+      <w:r>
+        <w:rPr>
+          <w:b/>
+        </w:rPr>
+        <w:t>Off</w:t>
+      </w:r>
+      <w:r>
+        <w:t>, then start MAMC ML Studio again. Microsoft Defender antivirus keeps protecting the laptop. With Windows updates from April 2026 onwards, Smart App Control can be switched on again later (MAMC ML Studio will then be blocked again).</w:t>
+      </w:r>
+    </w:p>
+    <w:p>
+      <w:pPr>
+        <w:spacing w:after="20"/>
+      </w:pPr>
+      <w:r>
+        <w:rPr>
+          <w:b/>
+        </w:rPr>
         <w:t>The Mac says the app cannot be opened.</w:t>
       </w:r>
     </w:p>

</xml_diff>